<commit_message>
Add a follow-along deck with real captures of each step; correct what Prairie saw
The follow-along deck (/follow, slides/follow-along.pptx) walks the do-along
step by step for anyone without a laptop. A live Prairie demo showed her agent
can report 2,400 escalation flags a week, so the decks and docs now say she saw
the flags and nothing about the 31-hour wait.

Co-Authored-By: Claude Fable 5.1 <noreply@anthropic.com>
</commit_message>
<xml_diff>
--- a/slides/walkthrough.docx
+++ b/slides/walkthrough.docx
@@ -403,7 +403,7 @@
         <w:t>her own</w:t>
       </w:r>
       <w:r>
-        <w:t xml:space="preserve"> assistant, which has been handed Northline's tools, and asks it for engagement and outcome evidence. She gets 78% weekly response and satisfaction of 72. She never asks about escalations, and nobody at Northline sees her conversation.</w:t>
+        <w:t xml:space="preserve"> assistant, which has been handed Northline's tools, and asks it for engagement and outcome evidence. She gets 78% weekly response and satisfaction of 72. If her assistant reports 2,400 escalation flags a week, that reads as the agent working: nothing Northline handed her says those flags wait 31 hours. Nobody at Northline sees her conversation.</w:t>
       </w:r>
     </w:p>
     <w:p>
@@ -415,7 +415,7 @@
       <w:r>
         <w:drawing>
           <wp:inline xmlns:a="http://schemas.openxmlformats.org/drawingml/2006/main" xmlns:pic="http://schemas.openxmlformats.org/drawingml/2006/picture">
-            <wp:extent cx="6120000" cy="3439440"/>
+            <wp:extent cx="6120000" cy="3442500"/>
             <wp:docPr id="5" name="Picture 5"/>
             <wp:cNvGraphicFramePr>
               <a:graphicFrameLocks noChangeAspect="1"/>
@@ -436,7 +436,7 @@
                   <pic:spPr>
                     <a:xfrm>
                       <a:off x="0" y="0"/>
-                      <a:ext cx="6120000" cy="3439440"/>
+                      <a:ext cx="6120000" cy="3442500"/>
                     </a:xfrm>
                     <a:prstGeom prst="rect"/>
                   </pic:spPr>
@@ -2508,7 +2508,7 @@
       <w:r>
         <w:drawing>
           <wp:inline xmlns:a="http://schemas.openxmlformats.org/drawingml/2006/main" xmlns:pic="http://schemas.openxmlformats.org/drawingml/2006/picture">
-            <wp:extent cx="6120000" cy="3439440"/>
+            <wp:extent cx="6120000" cy="3442500"/>
             <wp:docPr id="15" name="Picture 15"/>
             <wp:cNvGraphicFramePr>
               <a:graphicFrameLocks noChangeAspect="1"/>
@@ -2529,7 +2529,7 @@
                   <pic:spPr>
                     <a:xfrm>
                       <a:off x="0" y="0"/>
-                      <a:ext cx="6120000" cy="3439440"/>
+                      <a:ext cx="6120000" cy="3442500"/>
                     </a:xfrm>
                     <a:prstGeom prst="rect"/>
                   </pic:spPr>

</xml_diff>